<commit_message>
update entrypoint.sh for initial deployment
</commit_message>
<xml_diff>
--- a/metadata/Tim_dataverse_feedback_V3.docx
+++ b/metadata/Tim_dataverse_feedback_V3.docx
@@ -78,7 +78,6 @@
         </w:rPr>
         <w:t xml:space="preserve">Spelling: </w:t>
       </w:r>
-      <w:proofErr w:type="spellStart"/>
       <w:r>
         <w:rPr>
           <w:b/>
@@ -87,31 +86,8 @@
           <w:u w:val="single"/>
           <w:lang w:val="de-DE"/>
         </w:rPr>
-        <w:t>sinGLE</w:t>
+        <w:t>sinGLE" wavenumber</w:t>
       </w:r>
-      <w:proofErr w:type="spellEnd"/>
-      <w:r>
-        <w:rPr>
-          <w:b/>
-          <w:bCs/>
-          <w:highlight w:val="green"/>
-          <w:u w:val="single"/>
-          <w:lang w:val="de-DE"/>
-        </w:rPr>
-        <w:t xml:space="preserve">" </w:t>
-      </w:r>
-      <w:proofErr w:type="spellStart"/>
-      <w:r>
-        <w:rPr>
-          <w:b/>
-          <w:bCs/>
-          <w:highlight w:val="green"/>
-          <w:u w:val="single"/>
-          <w:lang w:val="de-DE"/>
-        </w:rPr>
-        <w:t>wavenumber</w:t>
-      </w:r>
-      <w:proofErr w:type="spellEnd"/>
     </w:p>
     <w:p>
       <w:r>
@@ -143,7 +119,6 @@
         </w:rPr>
         <w:t xml:space="preserve">Spelling: </w:t>
       </w:r>
-      <w:proofErr w:type="spellStart"/>
       <w:r>
         <w:rPr>
           <w:b/>
@@ -152,53 +127,8 @@
           <w:u w:val="single"/>
           <w:lang w:val="de-DE"/>
         </w:rPr>
-        <w:t>AdditioNAL</w:t>
+        <w:t>AdditioNAL citation metadata</w:t>
       </w:r>
-      <w:proofErr w:type="spellEnd"/>
-      <w:r>
-        <w:rPr>
-          <w:b/>
-          <w:bCs/>
-          <w:highlight w:val="green"/>
-          <w:u w:val="single"/>
-          <w:lang w:val="de-DE"/>
-        </w:rPr>
-        <w:t xml:space="preserve"> </w:t>
-      </w:r>
-      <w:proofErr w:type="spellStart"/>
-      <w:r>
-        <w:rPr>
-          <w:b/>
-          <w:bCs/>
-          <w:highlight w:val="green"/>
-          <w:u w:val="single"/>
-          <w:lang w:val="de-DE"/>
-        </w:rPr>
-        <w:t>citation</w:t>
-      </w:r>
-      <w:proofErr w:type="spellEnd"/>
-      <w:r>
-        <w:rPr>
-          <w:b/>
-          <w:bCs/>
-          <w:highlight w:val="green"/>
-          <w:u w:val="single"/>
-          <w:lang w:val="de-DE"/>
-        </w:rPr>
-        <w:t xml:space="preserve"> </w:t>
-      </w:r>
-      <w:proofErr w:type="spellStart"/>
-      <w:r>
-        <w:rPr>
-          <w:b/>
-          <w:bCs/>
-          <w:highlight w:val="green"/>
-          <w:u w:val="single"/>
-          <w:lang w:val="de-DE"/>
-        </w:rPr>
-        <w:t>metadata</w:t>
-      </w:r>
-      <w:proofErr w:type="spellEnd"/>
     </w:p>
     <w:p>
       <w:r>
@@ -211,45 +141,7 @@
         <w:t>whether</w:t>
       </w:r>
       <w:r>
-        <w:t xml:space="preserve"> to </w:t>
-      </w:r>
-      <w:proofErr w:type="gramStart"/>
-      <w:r>
-        <w:t>actually included</w:t>
-      </w:r>
-      <w:proofErr w:type="gramEnd"/>
-      <w:r>
-        <w:t xml:space="preserve"> this metadata block.</w:t>
-      </w:r>
-    </w:p>
-    <w:p/>
-    <w:p>
-      <w:pPr>
-        <w:pStyle w:val="Listenabsatz"/>
-        <w:numPr>
-          <w:ilvl w:val="0"/>
-          <w:numId w:val="13"/>
-        </w:numPr>
-        <w:rPr>
-          <w:b/>
-          <w:bCs/>
-          <w:highlight w:val="yellow"/>
-          <w:u w:val="single"/>
-        </w:rPr>
-      </w:pPr>
-      <w:r>
-        <w:rPr>
-          <w:b/>
-          <w:bCs/>
-          <w:highlight w:val="yellow"/>
-          <w:u w:val="single"/>
-        </w:rPr>
-        <w:t>Should additional citation metadata be removed for citation keywords?</w:t>
-      </w:r>
-    </w:p>
-    <w:p>
-      <w:r>
-        <w:t>Ask Alexandra again</w:t>
+        <w:t xml:space="preserve"> to actually included this metadata block.</w:t>
       </w:r>
     </w:p>
     <w:p/>
@@ -274,9 +166,29 @@
           <w:highlight w:val="green"/>
           <w:u w:val="single"/>
         </w:rPr>
-        <w:t xml:space="preserve">Sectioning device - model number is missing (Alexandra will take care </w:t>
+        <w:t>Should additional citation metadata be removed for citation keywords?</w:t>
       </w:r>
-      <w:proofErr w:type="gramStart"/>
+    </w:p>
+    <w:p>
+      <w:r>
+        <w:t>Yes remove</w:t>
+      </w:r>
+    </w:p>
+    <w:p/>
+    <w:p>
+      <w:pPr>
+        <w:pStyle w:val="Listenabsatz"/>
+        <w:numPr>
+          <w:ilvl w:val="0"/>
+          <w:numId w:val="13"/>
+        </w:numPr>
+        <w:rPr>
+          <w:b/>
+          <w:bCs/>
+          <w:highlight w:val="green"/>
+          <w:u w:val="single"/>
+        </w:rPr>
+      </w:pPr>
       <w:r>
         <w:rPr>
           <w:b/>
@@ -284,17 +196,7 @@
           <w:highlight w:val="green"/>
           <w:u w:val="single"/>
         </w:rPr>
-        <w:t>about</w:t>
-      </w:r>
-      <w:proofErr w:type="gramEnd"/>
-      <w:r>
-        <w:rPr>
-          <w:b/>
-          <w:bCs/>
-          <w:highlight w:val="green"/>
-          <w:u w:val="single"/>
-        </w:rPr>
-        <w:t xml:space="preserve"> the model numbers and send it to you)</w:t>
+        <w:t>Sectioning device - model number is missing (Alexandra will take care about the model numbers and send it to you)</w:t>
       </w:r>
     </w:p>
     <w:p>
@@ -315,7 +217,7 @@
         <w:rPr>
           <w:b/>
           <w:bCs/>
-          <w:highlight w:val="yellow"/>
+          <w:highlight w:val="green"/>
           <w:u w:val="single"/>
         </w:rPr>
       </w:pPr>
@@ -323,7 +225,7 @@
         <w:rPr>
           <w:b/>
           <w:bCs/>
-          <w:highlight w:val="yellow"/>
+          <w:highlight w:val="green"/>
           <w:u w:val="single"/>
         </w:rPr>
         <w:t>other sectioning device field is missing</w:t>
@@ -359,25 +261,7 @@
           <w:highlight w:val="green"/>
           <w:u w:val="single"/>
         </w:rPr>
-        <w:t>field missing: Scanner device (Aperio, Tissue scout,)</w:t>
-      </w:r>
-      <w:r>
-        <w:rPr>
-          <w:b/>
-          <w:bCs/>
-          <w:highlight w:val="green"/>
-          <w:u w:val="single"/>
-        </w:rPr>
-        <w:t xml:space="preserve"> </w:t>
-      </w:r>
-      <w:r>
-        <w:rPr>
-          <w:b/>
-          <w:bCs/>
-          <w:highlight w:val="green"/>
-          <w:u w:val="single"/>
-        </w:rPr>
-        <w:t>and type/model number is missing</w:t>
+        <w:t>field missing: Scanner device (Aperio, Tissue scout,) and type/model number is missing</w:t>
       </w:r>
     </w:p>
     <w:p>
@@ -385,10 +269,7 @@
         <w:t>Added to metadata block sample information</w:t>
       </w:r>
       <w:r>
-        <w:t xml:space="preserve"> </w:t>
-      </w:r>
-      <w:r>
-        <w:t>and included device names.</w:t>
+        <w:t xml:space="preserve"> and included device names.</w:t>
       </w:r>
     </w:p>
     <w:p>
@@ -438,6 +319,40 @@
           <w:u w:val="single"/>
         </w:rPr>
         <w:br/>
+        <w:t>Daty type: there we also have %Red. its doubled, also appears in processing</w:t>
+      </w:r>
+    </w:p>
+    <w:p>
+      <w:r>
+        <w:t xml:space="preserve">Renamed to data reduction, added yes/no dropdown, removed duplicate </w:t>
+      </w:r>
+      <w:r>
+        <w:t>reduced_processing_msi</w:t>
+      </w:r>
+    </w:p>
+    <w:p/>
+    <w:p>
+      <w:pPr>
+        <w:pStyle w:val="Listenabsatz"/>
+        <w:numPr>
+          <w:ilvl w:val="0"/>
+          <w:numId w:val="13"/>
+        </w:numPr>
+        <w:rPr>
+          <w:b/>
+          <w:bCs/>
+          <w:highlight w:val="green"/>
+          <w:u w:val="single"/>
+        </w:rPr>
+      </w:pPr>
+      <w:r>
+        <w:rPr>
+          <w:b/>
+          <w:bCs/>
+          <w:highlight w:val="green"/>
+          <w:u w:val="single"/>
+        </w:rPr>
+        <w:t>Make "sample information" as a separate global field like IR and MALDI and reduce sample prep in the IR and MALDI fields.</w:t>
       </w:r>
       <w:r>
         <w:rPr>
@@ -446,7 +361,17 @@
           <w:highlight w:val="green"/>
           <w:u w:val="single"/>
         </w:rPr>
-        <w:t>Daty type: there we also have %Red.</w:t>
+        <w:br/>
+        <w:t xml:space="preserve">IR: It will only have: "sample </w:t>
+      </w:r>
+      <w:r>
+        <w:rPr>
+          <w:b/>
+          <w:bCs/>
+          <w:highlight w:val="green"/>
+          <w:u w:val="single"/>
+        </w:rPr>
+        <w:t>preparation</w:t>
       </w:r>
       <w:r>
         <w:rPr>
@@ -464,60 +389,7 @@
           <w:highlight w:val="green"/>
           <w:u w:val="single"/>
         </w:rPr>
-        <w:t>its doubled</w:t>
-      </w:r>
-      <w:r>
-        <w:rPr>
-          <w:b/>
-          <w:bCs/>
-          <w:highlight w:val="green"/>
-          <w:u w:val="single"/>
-        </w:rPr>
-        <w:t xml:space="preserve">, </w:t>
-      </w:r>
-      <w:r>
-        <w:rPr>
-          <w:b/>
-          <w:bCs/>
-          <w:highlight w:val="green"/>
-          <w:u w:val="single"/>
-        </w:rPr>
-        <w:t>also appears in processing</w:t>
-      </w:r>
-    </w:p>
-    <w:p>
-      <w:r>
-        <w:t xml:space="preserve">Renamed to data reduction, added yes/no dropdown, removed duplicate </w:t>
-      </w:r>
-      <w:proofErr w:type="spellStart"/>
-      <w:r>
-        <w:t>reduced_processing_msi</w:t>
-      </w:r>
-      <w:proofErr w:type="spellEnd"/>
-    </w:p>
-    <w:p/>
-    <w:p>
-      <w:pPr>
-        <w:pStyle w:val="Listenabsatz"/>
-        <w:numPr>
-          <w:ilvl w:val="0"/>
-          <w:numId w:val="13"/>
-        </w:numPr>
-        <w:rPr>
-          <w:b/>
-          <w:bCs/>
-          <w:highlight w:val="green"/>
-          <w:u w:val="single"/>
-        </w:rPr>
-      </w:pPr>
-      <w:r>
-        <w:rPr>
-          <w:b/>
-          <w:bCs/>
-          <w:highlight w:val="green"/>
-          <w:u w:val="single"/>
-        </w:rPr>
-        <w:t>Make "sample information" as a separate global field like IR and MALDI and reduce sample prep in the IR and MALDI fields.</w:t>
+        <w:t>notes"</w:t>
       </w:r>
       <w:r>
         <w:rPr>
@@ -527,7 +399,7 @@
           <w:u w:val="single"/>
         </w:rPr>
         <w:br/>
-        <w:t>IR: It will only have: "sample notes"</w:t>
+        <w:t>MALDI: It will have: "wash" , "matrix type", "matrix instrument" and "sample notes</w:t>
       </w:r>
       <w:r>
         <w:rPr>
@@ -536,10 +408,8 @@
           <w:highlight w:val="green"/>
           <w:u w:val="single"/>
         </w:rPr>
-        <w:br/>
-        <w:t>MALDI: It will have: "wash</w:t>
+        <w:t xml:space="preserve"> </w:t>
       </w:r>
-      <w:proofErr w:type="gramStart"/>
       <w:r>
         <w:rPr>
           <w:b/>
@@ -547,9 +417,8 @@
           <w:highlight w:val="green"/>
           <w:u w:val="single"/>
         </w:rPr>
-        <w:t>" ,</w:t>
+        <w:t>preparation</w:t>
       </w:r>
-      <w:proofErr w:type="gramEnd"/>
       <w:r>
         <w:rPr>
           <w:b/>
@@ -557,7 +426,7 @@
           <w:highlight w:val="green"/>
           <w:u w:val="single"/>
         </w:rPr>
-        <w:t xml:space="preserve"> "matrix type", "matrix instrument" and "sample notes"</w:t>
+        <w:t>"</w:t>
       </w:r>
     </w:p>
     <w:p>
@@ -599,76 +468,7 @@
           <w:highlight w:val="green"/>
           <w:u w:val="single"/>
         </w:rPr>
-        <w:t xml:space="preserve">besides "wash" there should be a </w:t>
-      </w:r>
-      <w:proofErr w:type="spellStart"/>
-      <w:r>
-        <w:rPr>
-          <w:b/>
-          <w:bCs/>
-          <w:highlight w:val="green"/>
-          <w:u w:val="single"/>
-        </w:rPr>
-        <w:t>fied</w:t>
-      </w:r>
-      <w:proofErr w:type="spellEnd"/>
-      <w:r>
-        <w:rPr>
-          <w:b/>
-          <w:bCs/>
-          <w:highlight w:val="green"/>
-          <w:u w:val="single"/>
-        </w:rPr>
-        <w:t xml:space="preserve"> with "on-tissue digestion</w:t>
-      </w:r>
-      <w:proofErr w:type="gramStart"/>
-      <w:r>
-        <w:rPr>
-          <w:b/>
-          <w:bCs/>
-          <w:highlight w:val="green"/>
-          <w:u w:val="single"/>
-        </w:rPr>
-        <w:t>"  y</w:t>
-      </w:r>
-      <w:r>
-        <w:rPr>
-          <w:b/>
-          <w:bCs/>
-          <w:highlight w:val="green"/>
-          <w:u w:val="single"/>
-        </w:rPr>
-        <w:t>es</w:t>
-      </w:r>
-      <w:proofErr w:type="gramEnd"/>
-      <w:r>
-        <w:rPr>
-          <w:b/>
-          <w:bCs/>
-          <w:highlight w:val="green"/>
-          <w:u w:val="single"/>
-        </w:rPr>
-        <w:t>/no/trypsin/</w:t>
-      </w:r>
-      <w:proofErr w:type="spellStart"/>
-      <w:r>
-        <w:rPr>
-          <w:b/>
-          <w:bCs/>
-          <w:highlight w:val="green"/>
-          <w:u w:val="single"/>
-        </w:rPr>
-        <w:t>PNGase</w:t>
-      </w:r>
-      <w:proofErr w:type="spellEnd"/>
-      <w:r>
-        <w:rPr>
-          <w:b/>
-          <w:bCs/>
-          <w:highlight w:val="green"/>
-          <w:u w:val="single"/>
-        </w:rPr>
-        <w:t>/other</w:t>
+        <w:t>besides "wash" there should be a fied with "on-tissue digestion"  yes/no/trypsin/PNGase/other</w:t>
       </w:r>
       <w:r>
         <w:rPr>
@@ -678,14 +478,6 @@
           <w:u w:val="single"/>
         </w:rPr>
         <w:br/>
-      </w:r>
-      <w:r>
-        <w:rPr>
-          <w:b/>
-          <w:bCs/>
-          <w:highlight w:val="green"/>
-          <w:u w:val="single"/>
-        </w:rPr>
         <w:t>and add a field for "incubation"</w:t>
       </w:r>
     </w:p>
@@ -708,7 +500,7 @@
         <w:rPr>
           <w:b/>
           <w:bCs/>
-          <w:highlight w:val="yellow"/>
+          <w:highlight w:val="green"/>
           <w:u w:val="single"/>
         </w:rPr>
       </w:pPr>
@@ -716,7 +508,7 @@
         <w:rPr>
           <w:b/>
           <w:bCs/>
-          <w:highlight w:val="yellow"/>
+          <w:highlight w:val="green"/>
           <w:u w:val="single"/>
         </w:rPr>
         <w:t>Tissue treatment (y/n): "wash", "on-tissue digest" and "incubation", "staining" and "derivatization"</w:t>
@@ -725,83 +517,18 @@
         <w:rPr>
           <w:b/>
           <w:bCs/>
-          <w:highlight w:val="yellow"/>
+          <w:highlight w:val="green"/>
           <w:u w:val="single"/>
         </w:rPr>
-        <w:t xml:space="preserve"> </w:t>
-      </w:r>
-      <w:r>
-        <w:rPr>
-          <w:b/>
-          <w:bCs/>
-          <w:highlight w:val="yellow"/>
-          <w:u w:val="single"/>
-        </w:rPr>
-        <w:t>and subfields</w:t>
+        <w:t xml:space="preserve"> and subfields</w:t>
       </w:r>
     </w:p>
     <w:p>
       <w:r>
-        <w:t xml:space="preserve">Added tissue treatment with dropdown, </w:t>
-      </w:r>
-      <w:r>
-        <w:t>on-tissue digest</w:t>
-      </w:r>
-      <w:r>
-        <w:t xml:space="preserve"> </w:t>
-      </w:r>
-      <w:r>
-        <w:t>with dropdown and incubation</w:t>
-      </w:r>
-      <w:r>
-        <w:t xml:space="preserve"> </w:t>
-      </w:r>
-      <w:r>
-        <w:t>with dropdown, staining</w:t>
-      </w:r>
-      <w:r>
-        <w:t xml:space="preserve"> </w:t>
-      </w:r>
-      <w:r>
-        <w:t>with dropdown</w:t>
-      </w:r>
-      <w:r>
-        <w:t xml:space="preserve"> and free text</w:t>
-      </w:r>
-      <w:r>
-        <w:t xml:space="preserve"> and derivatization</w:t>
-      </w:r>
-      <w:r>
-        <w:t xml:space="preserve"> </w:t>
-      </w:r>
-      <w:r>
-        <w:t>with</w:t>
-      </w:r>
-      <w:r>
-        <w:t xml:space="preserve"> </w:t>
-      </w:r>
-      <w:r>
-        <w:t>dropdown</w:t>
-      </w:r>
-      <w:r>
-        <w:t xml:space="preserve"> and</w:t>
-      </w:r>
-      <w:r>
-        <w:t xml:space="preserve"> </w:t>
-      </w:r>
-      <w:r>
-        <w:t>free text</w:t>
+        <w:t>Added tissue treatment with dropdown, on-tissue digest with dropdown and incubation with dropdown, staining with dropdown and free text and derivatization with dropdown and free text</w:t>
       </w:r>
       <w:r>
         <w:t xml:space="preserve"> to MALDI metadata block.</w:t>
-      </w:r>
-    </w:p>
-    <w:p>
-      <w:r>
-        <w:rPr>
-          <w:highlight w:val="yellow"/>
-        </w:rPr>
-        <w:t>Incubation is pending due to missing info.</w:t>
       </w:r>
     </w:p>
     <w:p/>
@@ -819,7 +546,6 @@
           <w:u w:val="single"/>
         </w:rPr>
       </w:pPr>
-      <w:proofErr w:type="gramStart"/>
       <w:r>
         <w:rPr>
           <w:b/>
@@ -827,17 +553,7 @@
           <w:highlight w:val="green"/>
           <w:u w:val="single"/>
         </w:rPr>
-        <w:t>semicolons</w:t>
-      </w:r>
-      <w:proofErr w:type="gramEnd"/>
-      <w:r>
-        <w:rPr>
-          <w:b/>
-          <w:bCs/>
-          <w:highlight w:val="green"/>
-          <w:u w:val="single"/>
-        </w:rPr>
-        <w:t xml:space="preserve"> missing</w:t>
+        <w:t>semicolons missing</w:t>
       </w:r>
     </w:p>
     <w:p>

</xml_diff>